<commit_message>
feat: Enhance Hero section aesthetics, add registration fee (₹100), and update FAQs
</commit_message>
<xml_diff>
--- a/PlaceX_Hiring_Simulation.docx
+++ b/PlaceX_Hiring_Simulation.docx
@@ -1466,11 +1466,35 @@
                 <w:color w:val="0070C0"/>
               </w:rPr>
             </w:pPr>
+            <w:hyperlink r:id="rId7" w:history="1">
+              <w:r>
+                <w:rPr>
+                  <w:rStyle w:val="Hyperlink"/>
+                </w:rPr>
+                <w:t>https://bit.ly/PlaceX2026</w:t>
+              </w:r>
+            </w:hyperlink>
+          </w:p>
+          <w:p>
+            <w:pPr>
+              <w:widowControl w:val="0"/>
+              <w:pBdr>
+                <w:top w:val="nil"/>
+                <w:left w:val="nil"/>
+                <w:bottom w:val="nil"/>
+                <w:right w:val="nil"/>
+                <w:between w:val="nil"/>
+              </w:pBdr>
+              <w:spacing w:line="240" w:lineRule="auto"/>
+              <w:rPr>
+                <w:color w:val="0070C0"/>
+              </w:rPr>
+            </w:pPr>
             <w:r>
               <w:rPr>
                 <w:color w:val="0070C0"/>
               </w:rPr>
-              <w:t>https://bit.ly/PlaceX2026</w:t>
+              <w:t>https://hackerrank-place-x.vercel.app</w:t>
             </w:r>
           </w:p>
         </w:tc>
@@ -1593,7 +1617,7 @@
                           <pic:cNvPicPr/>
                         </pic:nvPicPr>
                         <pic:blipFill>
-                          <a:blip r:embed="rId7" cstate="print">
+                          <a:blip r:embed="rId8" cstate="print">
                             <a:extLst>
                               <a:ext uri="{28A0092B-C50C-407E-A947-70E740481C1C}">
                                 <a14:useLocalDpi xmlns:a14="http://schemas.microsoft.com/office/drawing/2010/main" val="0"/>
@@ -6665,6 +6689,7 @@
   <w:style w:type="character" w:default="1" w:styleId="DefaultParagraphFont">
     <w:name w:val="Default Paragraph Font"/>
     <w:uiPriority w:val="1"/>
+    <w:semiHidden/>
     <w:unhideWhenUsed/>
   </w:style>
   <w:style w:type="table" w:default="1" w:styleId="TableNormal">
@@ -6944,6 +6969,18 @@
     <w:rPr>
       <w:b/>
       <w:bCs/>
+    </w:rPr>
+  </w:style>
+  <w:style w:type="character" w:styleId="UnresolvedMention">
+    <w:name w:val="Unresolved Mention"/>
+    <w:basedOn w:val="DefaultParagraphFont"/>
+    <w:uiPriority w:val="99"/>
+    <w:semiHidden/>
+    <w:unhideWhenUsed/>
+    <w:rsid w:val="0009485A"/>
+    <w:rPr>
+      <w:color w:val="605E5C"/>
+      <w:shd w:val="clear" w:color="auto" w:fill="E1DFDD"/>
     </w:rPr>
   </w:style>
 </w:styles>
@@ -7270,28 +7307,28 @@
 </file>
 
 <file path=customXml/item1.xml><?xml version="1.0" encoding="utf-8"?>
-<b:Sources xmlns:b="http://schemas.openxmlformats.org/officeDocument/2006/bibliography" xmlns="http://schemas.openxmlformats.org/officeDocument/2006/bibliography" SelectedStyle="\APA.XSL" StyleName="APA"/>
-</file>
-
-<file path=customXml/item2.xml><?xml version="1.0" encoding="utf-8"?>
 <go:gDocsCustomXmlDataStorage xmlns:go="http://customooxmlschemas.google.com/" xmlns:r="http://schemas.openxmlformats.org/officeDocument/2006/relationships" uri="GoogleDocsCustomDataVersion2">
   <go:docsCustomData xmlns:go="http://customooxmlschemas.google.com/" roundtripDataSignature="AMtx7mg2D0PIO1QM0YBafbQV3yGH9NiBVA==">CgMxLjAyDmgud3lhbGIxd2dtZmVpMg5oLmU5c3pueDV4MGZuajINaC5qazJkdTFmZmd3bDIOaC5neTRxd2tnOGF1enMyDmguaTExbHU1c3d6bTI5OAByITFXTW5WeDdjQVNydFdDbFFjZTR0aVlNbXJhS085WDZ4Mg==</go:docsCustomData>
 </go:gDocsCustomXmlDataStorage>
 </file>
 
-<file path=customXml/itemProps1.xml><?xml version="1.0" encoding="utf-8"?>
-<ds:datastoreItem xmlns:ds="http://schemas.openxmlformats.org/officeDocument/2006/customXml" ds:itemID="{EADBA68D-7F96-41E3-821D-EECFC11654A4}">
-  <ds:schemaRefs>
-    <ds:schemaRef ds:uri="http://schemas.openxmlformats.org/officeDocument/2006/bibliography"/>
-  </ds:schemaRefs>
-</ds:datastoreItem>
+<file path=customXml/item2.xml><?xml version="1.0" encoding="utf-8"?>
+<b:Sources xmlns:b="http://schemas.openxmlformats.org/officeDocument/2006/bibliography" xmlns="http://schemas.openxmlformats.org/officeDocument/2006/bibliography" SelectedStyle="\APA.XSL" StyleName="APA"/>
 </file>
 
-<file path=customXml/itemProps2.xml><?xml version="1.0" encoding="utf-8"?>
+<file path=customXml/itemProps1.xml><?xml version="1.0" encoding="utf-8"?>
 <ds:datastoreItem xmlns:ds="http://schemas.openxmlformats.org/officeDocument/2006/customXml" ds:itemID="{11111111-1234-1234-1234-123412341234}">
   <ds:schemaRefs>
     <ds:schemaRef ds:uri="http://customooxmlschemas.google.com/"/>
     <ds:schemaRef ds:uri="http://schemas.openxmlformats.org/officeDocument/2006/relationships"/>
   </ds:schemaRefs>
 </ds:datastoreItem>
+</file>
+
+<file path=customXml/itemProps2.xml><?xml version="1.0" encoding="utf-8"?>
+<ds:datastoreItem xmlns:ds="http://schemas.openxmlformats.org/officeDocument/2006/customXml" ds:itemID="{EADBA68D-7F96-41E3-821D-EECFC11654A4}">
+  <ds:schemaRefs>
+    <ds:schemaRef ds:uri="http://schemas.openxmlformats.org/officeDocument/2006/bibliography"/>
+  </ds:schemaRefs>
+</ds:datastoreItem>
 </file>
</xml_diff>